<commit_message>
Apply Feedback to speaker notes
</commit_message>
<xml_diff>
--- a/talk/Performance-Optimierung JUG.docx
+++ b/talk/Performance-Optimierung JUG.docx
@@ -130,58 +130,59 @@
       </w:r>
       <w:r>
         <w:br/>
-        <w:t xml:space="preserve">  * Warum Performance wichtig ist</w:t>
-      </w:r>
-      <w:r>
-        <w:br/>
-        <w:t xml:space="preserve">  * Wie man Performance misst und bewertet</w:t>
-      </w:r>
-      <w:r>
-        <w:br/>
-        <w:t xml:space="preserve">  * Vor allem aber auch, wie man sie ganz konkret verbessert</w:t>
-      </w:r>
-      <w:r>
-        <w:br/>
-        <w:t xml:space="preserve">    * in beliebigen Programmiersprachen wie Python</w:t>
-      </w:r>
-      <w:r>
-        <w:br/>
-        <w:t xml:space="preserve">    * in Visual Basic und Turbo Pascal</w:t>
-      </w:r>
-      <w:r>
-        <w:br/>
-        <w:t xml:space="preserve">    * und wir natürlich in unserer aller Lieblingssprache Java</w:t>
-      </w:r>
-      <w:r>
-        <w:br/>
-        <w:t>* wir nehmen uns heute ein bis zwei Stunden Zeit</w:t>
-      </w:r>
-      <w:r>
-        <w:br/>
-        <w:t xml:space="preserve">  * mit einigen Folien</w:t>
-      </w:r>
-      <w:r>
-        <w:br/>
-        <w:t xml:space="preserve">  * mit ganz viel Live-Coding</w:t>
-      </w:r>
-      <w:r>
-        <w:br/>
-        <w:t xml:space="preserve">  * und Euren Fragen und Anregungen zwischendrin</w:t>
-      </w:r>
-      <w:r>
-        <w:br/>
-        <w:t xml:space="preserve">    * meldet euch gerne jederzeit</w:t>
-      </w:r>
-      <w:r>
-        <w:br/>
-      </w:r>
-      <w:r>
-        <w:br/>
-        <w:t>* Es gibt so viele unterschiedliche Arbeitsfelder</w:t>
-      </w:r>
-      <w:r>
-        <w:br/>
-        <w:t>* Java ist so vielseitig</w:t>
+        <w:t xml:space="preserve">  * Teil 1 </w:t>
+      </w:r>
+      <w:r>
+        <w:br/>
+        <w:t xml:space="preserve">    * Angaben von Performance in der API-Dokumentation</w:t>
+      </w:r>
+      <w:r>
+        <w:br/>
+        <w:t xml:space="preserve">    * Vereinbarung von Performance für konkrete Projekte und Produkte</w:t>
+      </w:r>
+      <w:r>
+        <w:br/>
+        <w:t xml:space="preserve">    * Ein paar Ideen zur Performance</w:t>
+      </w:r>
+      <w:r>
+        <w:br/>
+        <w:t xml:space="preserve">    * Sinn und Unsinn von Performance-Optimierung</w:t>
+      </w:r>
+      <w:r>
+        <w:br/>
+        <w:t xml:space="preserve">  * Teil 2</w:t>
+      </w:r>
+      <w:r>
+        <w:br/>
+        <w:t xml:space="preserve">    * Hands-On Optimierung in Java</w:t>
+      </w:r>
+      <w:r>
+        <w:br/>
+        <w:t xml:space="preserve">    * Genauso übertragbar auf deine lieblings-Hobbysprache</w:t>
+      </w:r>
+      <w:r>
+        <w:br/>
+        <w:t xml:space="preserve">      * in Visual Basic, PHP oder Python</w:t>
+      </w:r>
+      <w:r>
+        <w:br/>
+      </w:r>
+      <w:r>
+        <w:br/>
+        <w:t xml:space="preserve">* Viele kenne ich vom Sehen | vom nebeneinander </w:t>
+      </w:r>
+      <w:proofErr w:type="spellStart"/>
+      <w:r>
+        <w:t>Sitzen</w:t>
+      </w:r>
+      <w:proofErr w:type="spellEnd"/>
+      <w:r>
+        <w:br/>
+        <w:t>* Um uns besser kennen zu lernen | um Bedeutung von Performance zu verstehen</w:t>
+      </w:r>
+      <w:r>
+        <w:br/>
+        <w:t>* Kurze Umfrage: In welchem Bereich arbeitet Ihr?</w:t>
       </w:r>
       <w:r>
         <w:br/>
@@ -193,40 +194,58 @@
       </w:r>
       <w:proofErr w:type="spellEnd"/>
       <w:r>
-        <w:t xml:space="preserve"> im Bereich Online-Shop?"</w:t>
-      </w:r>
-      <w:r>
-        <w:br/>
-        <w:t xml:space="preserve">&gt; Umfrage "Wer von Euch </w:t>
-      </w:r>
-      <w:proofErr w:type="spellStart"/>
-      <w:r>
-        <w:t>coded</w:t>
-      </w:r>
-      <w:proofErr w:type="spellEnd"/>
-      <w:r>
-        <w:t xml:space="preserve"> im Bereich Embedded?" (Mehrfachnennungen möglich)</w:t>
-      </w:r>
-      <w:r>
-        <w:br/>
-        <w:t>&gt; Umfrage "Wer baut Software für Big-Data und KI?"</w:t>
-      </w:r>
-      <w:r>
-        <w:br/>
-        <w:t>&gt; Umfrage "Hat jemand von Euch beruflich mit Blockchain zu tun?"</w:t>
-      </w:r>
-      <w:r>
-        <w:br/>
-        <w:t>&gt; Umfrage "Oder schreibt Software im Bereich Grafik, CAD oder Spielentwicklung?"</w:t>
-      </w:r>
-      <w:r>
-        <w:br/>
+        <w:t xml:space="preserve"> im Bereich Webentwicklung?"</w:t>
+      </w:r>
+      <w:r>
+        <w:br/>
+        <w:t xml:space="preserve">&gt; Umfrage "Wer von Euch schreibt HTTP </w:t>
+      </w:r>
+      <w:proofErr w:type="spellStart"/>
+      <w:r>
+        <w:t>Backends</w:t>
+      </w:r>
+      <w:proofErr w:type="spellEnd"/>
+      <w:r>
+        <w:t>?"</w:t>
+      </w:r>
+      <w:r>
+        <w:br/>
+        <w:t xml:space="preserve">  * Mehrfachnennungen möglich</w:t>
+      </w:r>
+      <w:r>
+        <w:br/>
+        <w:t>&gt; Umfrage "Wer von Euch baut Desktop-Anwendungen?"</w:t>
+      </w:r>
+      <w:r>
+        <w:br/>
+        <w:t xml:space="preserve">&gt; Umfrage "Wer von Euch arbeitet mit Daten aus IoT, </w:t>
+      </w:r>
+      <w:proofErr w:type="spellStart"/>
+      <w:r>
+        <w:t>Telemetik</w:t>
+      </w:r>
+      <w:proofErr w:type="spellEnd"/>
+      <w:r>
+        <w:t>?"</w:t>
+      </w:r>
+      <w:r>
+        <w:br/>
+        <w:t xml:space="preserve">&gt; Umfrage "Wer von Euch schreibt Software, die in der Cloud läuft - z.B. AWS, Azure, Google </w:t>
+      </w:r>
+      <w:proofErr w:type="spellStart"/>
+      <w:r>
+        <w:t>Compute</w:t>
+      </w:r>
+      <w:proofErr w:type="spellEnd"/>
+      <w:r>
+        <w:t xml:space="preserve"> Engine?"</w:t>
       </w:r>
       <w:r>
         <w:br/>
       </w:r>
       <w:r>
         <w:lastRenderedPageBreak/>
+        <w:br/>
         <w:t>* Es gibt Bereiche in der IT, in denen ist Performance das offensichtliche Kriterium</w:t>
       </w:r>
       <w:r>
@@ -294,10 +313,17 @@
       </w:r>
       <w:proofErr w:type="spellEnd"/>
       <w:r>
-        <w:t xml:space="preserve"> opencsv](https://apidia.net/mvn/com.opencsv/opencsv/5.9/?pck=com.opencsv.bean&amp;cls=.CsvToBeanBuilder#build-)</w:t>
-      </w:r>
-      <w:r>
-        <w:br/>
+        <w:t xml:space="preserve"> </w:t>
+      </w:r>
+      <w:proofErr w:type="spellStart"/>
+      <w:r>
+        <w:t>opencsv</w:t>
+      </w:r>
+      <w:proofErr w:type="spellEnd"/>
+      <w:r>
+        <w:br/>
+      </w:r>
+      <w:r>
         <w:t xml:space="preserve">  * Da wird die Funktion beschrieben</w:t>
       </w:r>
       <w:r>
@@ -311,92 +337,6 @@
       <w:r>
         <w:br/>
         <w:t xml:space="preserve">  * und wie sicher, wie schnell ist das?</w:t>
-      </w:r>
-      <w:r>
-        <w:br/>
-      </w:r>
-      <w:r>
-        <w:lastRenderedPageBreak/>
-        <w:t>* Es ist nicht angegeben, weil es</w:t>
-      </w:r>
-      <w:r>
-        <w:br/>
-        <w:t xml:space="preserve">  * uns meist zum Glück nicht interessiert</w:t>
-      </w:r>
-      <w:r>
-        <w:br/>
-        <w:t xml:space="preserve">  * weil wir schnelle Hardware haben</w:t>
-      </w:r>
-      <w:r>
-        <w:br/>
-        <w:t xml:space="preserve">  * weil es auch einfach schwer anzugeben ist</w:t>
-      </w:r>
-      <w:r>
-        <w:br/>
-        <w:t xml:space="preserve">    * je nach Computer</w:t>
-      </w:r>
-      <w:r>
-        <w:br/>
-        <w:t xml:space="preserve">    * je nach Eingabedaten</w:t>
-      </w:r>
-      <w:r>
-        <w:br/>
-        <w:t xml:space="preserve">    * je nach Betriebssystem</w:t>
-      </w:r>
-      <w:r>
-        <w:br/>
-        <w:t xml:space="preserve">    * je nach JVM</w:t>
-      </w:r>
-      <w:r>
-        <w:br/>
-      </w:r>
-      <w:r>
-        <w:br/>
-        <w:t xml:space="preserve">&gt; Würze: Übersicht </w:t>
-      </w:r>
-      <w:proofErr w:type="spellStart"/>
-      <w:r>
-        <w:t>JavaDoc</w:t>
-      </w:r>
-      <w:proofErr w:type="spellEnd"/>
-      <w:r>
-        <w:t xml:space="preserve"> Performanceangaben</w:t>
-      </w:r>
-      <w:r>
-        <w:br/>
-      </w:r>
-      <w:r>
-        <w:br/>
-        <w:t xml:space="preserve">* In der offiziellen </w:t>
-      </w:r>
-      <w:proofErr w:type="spellStart"/>
-      <w:r>
-        <w:t>JavaDoc</w:t>
-      </w:r>
-      <w:proofErr w:type="spellEnd"/>
-      <w:r>
-        <w:br/>
-        <w:t>* Hauptsächlich bei Collections</w:t>
-      </w:r>
-      <w:r>
-        <w:br/>
-        <w:t>* Angaben wie "</w:t>
-      </w:r>
-      <w:proofErr w:type="spellStart"/>
-      <w:r>
-        <w:t>constant</w:t>
-      </w:r>
-      <w:proofErr w:type="spellEnd"/>
-      <w:r>
-        <w:t xml:space="preserve"> time", "linear time", "</w:t>
-      </w:r>
-      <w:proofErr w:type="spellStart"/>
-      <w:r>
-        <w:t>logarithmic</w:t>
-      </w:r>
-      <w:proofErr w:type="spellEnd"/>
-      <w:r>
-        <w:t xml:space="preserve"> time"</w:t>
       </w:r>
     </w:p>
     <w:p>
@@ -407,153 +347,278 @@
     <w:p>
       <w:r>
         <w:lastRenderedPageBreak/>
-        <w:t>### Big-O</w:t>
-      </w:r>
-      <w:r>
-        <w:br/>
-      </w:r>
-      <w:r>
-        <w:br/>
-        <w:t>* Deshalb in Informatik Konzept von "Big-O-Notation"</w:t>
-      </w:r>
-      <w:r>
-        <w:br/>
-        <w:t xml:space="preserve">  * Wir sagen, inwiefern die Laufzeit von der Größe der Eingabedaten abhängt</w:t>
-      </w:r>
-      <w:r>
-        <w:br/>
-        <w:t xml:space="preserve">  * Braucht ein Programm immer gleich viel Zeit?</w:t>
-      </w:r>
-      <w:r>
-        <w:br/>
-        <w:t xml:space="preserve">    * O(1) - konstante Zeit</w:t>
-      </w:r>
-      <w:r>
-        <w:br/>
-        <w:t xml:space="preserve">    * =&gt; vorzeigen mit </w:t>
-      </w:r>
-      <w:proofErr w:type="spellStart"/>
-      <w:r>
-        <w:t>graph</w:t>
-      </w:r>
-      <w:proofErr w:type="spellEnd"/>
-      <w:r>
-        <w:t>-tool</w:t>
-      </w:r>
-      <w:r>
-        <w:br/>
-        <w:t xml:space="preserve">  * oder braucht es bei doppelt so vielen Daten auch doppelt so viel Zeit?</w:t>
-      </w:r>
-      <w:r>
-        <w:br/>
-        <w:t xml:space="preserve">    * O(n) - lineare Zeit</w:t>
-      </w:r>
-      <w:r>
-        <w:br/>
-        <w:t xml:space="preserve">    * =&gt; vorzeigen mit </w:t>
-      </w:r>
-      <w:proofErr w:type="spellStart"/>
-      <w:r>
-        <w:t>graph</w:t>
-      </w:r>
-      <w:proofErr w:type="spellEnd"/>
-      <w:r>
-        <w:t>-tool</w:t>
-      </w:r>
-      <w:r>
-        <w:br/>
-        <w:t xml:space="preserve">  * Genauer gesagt:</w:t>
-      </w:r>
-      <w:r>
-        <w:br/>
-        <w:t xml:space="preserve">    * Finden wir</w:t>
-      </w:r>
-      <w:r>
-        <w:br/>
-        <w:t xml:space="preserve">      * eine Horizontale,</w:t>
-      </w:r>
-      <w:r>
-        <w:br/>
-        <w:t xml:space="preserve">      * eine Gerade,</w:t>
-      </w:r>
-      <w:r>
-        <w:br/>
-        <w:t xml:space="preserve">      * eine Parabel,</w:t>
-      </w:r>
-      <w:r>
-        <w:br/>
-        <w:t xml:space="preserve">      * eine Exponentialfunktion,</w:t>
-      </w:r>
-      <w:r>
-        <w:br/>
-        <w:t xml:space="preserve">    * Unter der die Laufzeit immer liegt, egal wie groß die Datenmenge auch sein mag?</w:t>
-      </w:r>
-      <w:r>
-        <w:br/>
-        <w:t xml:space="preserve">      * =&gt; </w:t>
-      </w:r>
-      <w:proofErr w:type="spellStart"/>
-      <w:r>
-        <w:t>Komplexitat</w:t>
-      </w:r>
-      <w:proofErr w:type="spellEnd"/>
-      <w:r>
-        <w:br/>
-        <w:t xml:space="preserve">  * Genauer gesagt: Zeitkomplexität (über Speicher-Komplexität heute nicht)</w:t>
-      </w:r>
-      <w:r>
-        <w:br/>
+        <w:br/>
+        <w:t>* Es ist nicht angegeben, weil es</w:t>
+      </w:r>
+      <w:r>
+        <w:br/>
+        <w:t xml:space="preserve">  * uns meist zum Glück nicht interessiert</w:t>
+      </w:r>
+      <w:r>
+        <w:br/>
+        <w:t xml:space="preserve">  </w:t>
+      </w:r>
+      <w:proofErr w:type="gramStart"/>
+      <w:r>
+        <w:t>*</w:t>
+      </w:r>
+      <w:proofErr w:type="gramEnd"/>
+      <w:r>
+        <w:t xml:space="preserve"> weil wir schnelle Hardware </w:t>
+      </w:r>
+      <w:proofErr w:type="gramStart"/>
+      <w:r>
+        <w:t>haben</w:t>
+      </w:r>
+      <w:proofErr w:type="gramEnd"/>
+      <w:r>
+        <w:br/>
+        <w:t xml:space="preserve">  </w:t>
+      </w:r>
+      <w:proofErr w:type="gramStart"/>
+      <w:r>
+        <w:t>*</w:t>
+      </w:r>
+      <w:proofErr w:type="gramEnd"/>
+      <w:r>
+        <w:t xml:space="preserve"> weil es auch einfach schwer anzugeben </w:t>
+      </w:r>
+      <w:proofErr w:type="gramStart"/>
+      <w:r>
+        <w:t>ist</w:t>
+      </w:r>
+      <w:proofErr w:type="gramEnd"/>
+      <w:r>
+        <w:br/>
+        <w:t xml:space="preserve">    * je nach Computer</w:t>
+      </w:r>
+      <w:r>
+        <w:br/>
+        <w:t xml:space="preserve">    * je nach Eingabedaten</w:t>
+      </w:r>
+      <w:r>
+        <w:br/>
+        <w:t xml:space="preserve">    * je nach Betriebssystem</w:t>
+      </w:r>
+      <w:r>
+        <w:br/>
+        <w:t xml:space="preserve">    * je nach JVM</w:t>
+      </w:r>
+      <w:r>
+        <w:br/>
+      </w:r>
+      <w:r>
+        <w:br/>
+        <w:t xml:space="preserve">&gt; Würze: Übersicht </w:t>
+      </w:r>
+      <w:proofErr w:type="spellStart"/>
+      <w:r>
+        <w:t>JavaDoc</w:t>
+      </w:r>
+      <w:proofErr w:type="spellEnd"/>
+      <w:r>
+        <w:t xml:space="preserve"> Performanceangaben</w:t>
+      </w:r>
+      <w:r>
+        <w:br/>
+      </w:r>
+      <w:r>
+        <w:br/>
+        <w:t xml:space="preserve">* In der offiziellen </w:t>
+      </w:r>
+      <w:proofErr w:type="spellStart"/>
+      <w:r>
+        <w:t>JavaDoc</w:t>
+      </w:r>
+      <w:proofErr w:type="spellEnd"/>
+      <w:r>
+        <w:br/>
+        <w:t xml:space="preserve">* </w:t>
+      </w:r>
+      <w:proofErr w:type="gramStart"/>
+      <w:r>
+        <w:t>Hauptsächlich</w:t>
+      </w:r>
+      <w:proofErr w:type="gramEnd"/>
+      <w:r>
+        <w:t xml:space="preserve"> bei Collections</w:t>
+      </w:r>
+      <w:r>
+        <w:br/>
+        <w:t>* Angaben wie "</w:t>
+      </w:r>
+      <w:proofErr w:type="spellStart"/>
+      <w:r>
+        <w:t>constant</w:t>
+      </w:r>
+      <w:proofErr w:type="spellEnd"/>
+      <w:r>
+        <w:t xml:space="preserve"> time", "linear time", "</w:t>
+      </w:r>
+      <w:proofErr w:type="spellStart"/>
+      <w:r>
+        <w:t>logarithmic</w:t>
+      </w:r>
+      <w:proofErr w:type="spellEnd"/>
+      <w:r>
+        <w:t xml:space="preserve"> time"</w:t>
       </w:r>
     </w:p>
     <w:p>
       <w:r>
-        <w:lastRenderedPageBreak/>
-        <w:br/>
-        <w:t>* Konstante Faktoren werden bei Big-O ignoriert</w:t>
-      </w:r>
-      <w:r>
-        <w:br/>
-        <w:t xml:space="preserve">  * in linear: in schleife "do </w:t>
-      </w:r>
-      <w:proofErr w:type="spellStart"/>
-      <w:r>
-        <w:t>something</w:t>
-      </w:r>
-      <w:proofErr w:type="spellEnd"/>
-      <w:r>
-        <w:t>" 3x drinnen</w:t>
-      </w:r>
-      <w:r>
-        <w:br/>
-        <w:t xml:space="preserve">  * in linear: drei schleifen je mit einmal "do </w:t>
-      </w:r>
-      <w:proofErr w:type="spellStart"/>
-      <w:r>
-        <w:t>something</w:t>
-      </w:r>
-      <w:proofErr w:type="spellEnd"/>
-      <w:r>
-        <w:t>"</w:t>
-      </w:r>
-      <w:r>
-        <w:br/>
-        <w:t xml:space="preserve">  * und wenn wir innerhalb von "do </w:t>
-      </w:r>
-      <w:proofErr w:type="spellStart"/>
-      <w:r>
-        <w:t>something</w:t>
-      </w:r>
-      <w:proofErr w:type="spellEnd"/>
-      <w:r>
-        <w:t>" in Zukunft drei Dinge tun?</w:t>
-      </w:r>
-      <w:r>
-        <w:br/>
-        <w:t xml:space="preserve">  * Alles in der theoretischen Welt von Big-O: O(n)</w:t>
+        <w:br w:type="page"/>
       </w:r>
     </w:p>
     <w:p>
       <w:r>
+        <w:lastRenderedPageBreak/>
+        <w:t>### Big-O</w:t>
+      </w:r>
+      <w:r>
+        <w:br/>
+      </w:r>
+      <w:r>
+        <w:br/>
+        <w:t>* Deshalb in Informatik Konzept von "Big-O-Notation"</w:t>
+      </w:r>
+      <w:r>
+        <w:br/>
+        <w:t xml:space="preserve">  * Wir sagen, inwiefern die Laufzeit von der Größe der Eingabedaten abhängt</w:t>
+      </w:r>
+      <w:r>
+        <w:br/>
+        <w:t xml:space="preserve">  * Braucht ein Programm immer gleich viel Zeit?</w:t>
+      </w:r>
+      <w:r>
+        <w:br/>
+        <w:t xml:space="preserve">    * O(1) - konstante Zeit</w:t>
+      </w:r>
+      <w:r>
+        <w:br/>
+        <w:t xml:space="preserve">    * =&gt; vorzeigen mit </w:t>
+      </w:r>
+      <w:proofErr w:type="spellStart"/>
+      <w:r>
+        <w:t>graph</w:t>
+      </w:r>
+      <w:proofErr w:type="spellEnd"/>
+      <w:r>
+        <w:t>-tool</w:t>
+      </w:r>
+      <w:r>
+        <w:br/>
+        <w:t xml:space="preserve">  * oder braucht es bei doppelt so vielen Daten auch doppelt so viel Zeit?</w:t>
+      </w:r>
+      <w:r>
+        <w:br/>
+        <w:t xml:space="preserve">    * O(n) - lineare Zeit</w:t>
+      </w:r>
+      <w:r>
+        <w:br/>
+        <w:t xml:space="preserve">    * =&gt; vorzeigen mit </w:t>
+      </w:r>
+      <w:proofErr w:type="spellStart"/>
+      <w:r>
+        <w:t>graph</w:t>
+      </w:r>
+      <w:proofErr w:type="spellEnd"/>
+      <w:r>
+        <w:t>-tool</w:t>
+      </w:r>
+      <w:r>
+        <w:br/>
+        <w:t xml:space="preserve">  * Genauer gesagt:</w:t>
+      </w:r>
+      <w:r>
+        <w:br/>
+        <w:t xml:space="preserve">    * Finden wir</w:t>
+      </w:r>
+      <w:r>
+        <w:br/>
+        <w:t xml:space="preserve">      * eine Horizontale,</w:t>
+      </w:r>
+      <w:r>
+        <w:br/>
+        <w:t xml:space="preserve">      * eine Gerade,</w:t>
+      </w:r>
+      <w:r>
+        <w:br/>
+        <w:t xml:space="preserve">      * eine Parabel,</w:t>
+      </w:r>
+      <w:r>
+        <w:br/>
+        <w:t xml:space="preserve">      * eine Exponentialfunktion,</w:t>
+      </w:r>
+      <w:r>
+        <w:br/>
+        <w:t xml:space="preserve">    * Unter der die Laufzeit immer liegt, egal wie groß die Datenmenge auch sein mag?</w:t>
+      </w:r>
+      <w:r>
+        <w:br/>
+        <w:t xml:space="preserve">      * =&gt; </w:t>
+      </w:r>
+      <w:proofErr w:type="spellStart"/>
+      <w:r>
+        <w:t>Komplexitat</w:t>
+      </w:r>
+      <w:proofErr w:type="spellEnd"/>
+      <w:r>
+        <w:br/>
+        <w:t xml:space="preserve">  * Genauer gesagt: Zeitkomplexität (über Speicher-Komplexität heute nicht)</w:t>
+      </w:r>
+      <w:r>
+        <w:br/>
+      </w:r>
+    </w:p>
+    <w:p>
+      <w:r>
+        <w:lastRenderedPageBreak/>
+        <w:br/>
+        <w:t>* Konstante Faktoren werden bei Big-O ignoriert</w:t>
+      </w:r>
+      <w:r>
+        <w:br/>
+        <w:t xml:space="preserve">  * in linear: in schleife "do </w:t>
+      </w:r>
+      <w:proofErr w:type="spellStart"/>
+      <w:r>
+        <w:t>something</w:t>
+      </w:r>
+      <w:proofErr w:type="spellEnd"/>
+      <w:r>
+        <w:t>" 3x drinnen</w:t>
+      </w:r>
+      <w:r>
+        <w:br/>
+        <w:t xml:space="preserve">  * in linear: drei schleifen je mit einmal "do </w:t>
+      </w:r>
+      <w:proofErr w:type="spellStart"/>
+      <w:r>
+        <w:t>something</w:t>
+      </w:r>
+      <w:proofErr w:type="spellEnd"/>
+      <w:r>
+        <w:t>"</w:t>
+      </w:r>
+      <w:r>
+        <w:br/>
+        <w:t xml:space="preserve">  * und wenn wir innerhalb von "do </w:t>
+      </w:r>
+      <w:proofErr w:type="spellStart"/>
+      <w:r>
+        <w:t>something</w:t>
+      </w:r>
+      <w:proofErr w:type="spellEnd"/>
+      <w:r>
+        <w:t>" in Zukunft drei Dinge tun?</w:t>
+      </w:r>
+      <w:r>
+        <w:br/>
+        <w:t xml:space="preserve">  * Alles in der theoretischen Welt von Big-O: O(n)</w:t>
+      </w:r>
+    </w:p>
+    <w:p>
+      <w:r>
         <w:t xml:space="preserve">### Problem mit </w:t>
       </w:r>
       <w:proofErr w:type="spellStart"/>
@@ -581,12 +646,33 @@
       </w:r>
       <w:r>
         <w:br/>
-        <w:t xml:space="preserve">  * Wenn du das herausfinden willst</w:t>
-      </w:r>
-      <w:r>
-        <w:br/>
-        <w:t xml:space="preserve">  * Musst Du auch jeden Code kennen, dem Du Deinen Input weitergibst</w:t>
-      </w:r>
+        <w:t xml:space="preserve">  * Wenn du </w:t>
+      </w:r>
+      <w:proofErr w:type="gramStart"/>
+      <w:r>
+        <w:t>das herausfinden</w:t>
+      </w:r>
+      <w:proofErr w:type="gramEnd"/>
+      <w:r>
+        <w:t xml:space="preserve"> willst</w:t>
+      </w:r>
+      <w:r>
+        <w:br/>
+        <w:t xml:space="preserve">  * </w:t>
+      </w:r>
+      <w:proofErr w:type="gramStart"/>
+      <w:r>
+        <w:t>Musst</w:t>
+      </w:r>
+      <w:proofErr w:type="gramEnd"/>
+      <w:r>
+        <w:t xml:space="preserve"> Du auch jeden Code kennen, dem Du Deinen Input </w:t>
+      </w:r>
+      <w:proofErr w:type="gramStart"/>
+      <w:r>
+        <w:t>weitergibst</w:t>
+      </w:r>
+      <w:proofErr w:type="gramEnd"/>
       <w:r>
         <w:br/>
       </w:r>

</xml_diff>